<commit_message>
feat: add highest administrator user management
</commit_message>
<xml_diff>
--- a/output/doc/仕舟小程序管理员运营操作手册.docx
+++ b/output/doc/仕舟小程序管理员运营操作手册.docx
@@ -1140,6 +1140,58 @@
         <w:rPr>
           <w:rFonts w:ascii="Arial Unicode MS" w:hAnsi="Arial Unicode MS" w:eastAsia="Arial Unicode MS"/>
         </w:rPr>
+        <w:t>1.0 管理员级别</w:t>
+      </w:r>
+    </w:p>
+    <w:p>
+      <w:pPr>
+        <w:pStyle w:val="ListBullet"/>
+      </w:pPr>
+      <w:r>
+        <w:rPr>
+          <w:rFonts w:ascii="Arial Unicode MS" w:hAnsi="Arial Unicode MS" w:eastAsia="Arial Unicode MS"/>
+        </w:rPr>
+        <w:t>最高管理员：唯一账号，拥有全部运营功能，并可新增、取消普通管理员或移交最高权限。</w:t>
+      </w:r>
+    </w:p>
+    <w:p>
+      <w:pPr>
+        <w:pStyle w:val="ListBullet"/>
+      </w:pPr>
+      <w:r>
+        <w:rPr>
+          <w:rFonts w:ascii="Arial Unicode MS" w:hAnsi="Arial Unicode MS" w:eastAsia="Arial Unicode MS"/>
+        </w:rPr>
+        <w:t>普通管理员：可维护题库、资料、广告、消息等日常内容，不能设置其他管理员。</w:t>
+      </w:r>
+    </w:p>
+    <w:p>
+      <w:pPr>
+        <w:pStyle w:val="ListBullet"/>
+      </w:pPr>
+      <w:r>
+        <w:rPr>
+          <w:rFonts w:ascii="Arial Unicode MS" w:hAnsi="Arial Unicode MS" w:eastAsia="Arial Unicode MS"/>
+        </w:rPr>
+        <w:t>普通用户：不能进入管理员工作台。</w:t>
+      </w:r>
+    </w:p>
+    <w:p>
+      <w:r>
+        <w:rPr>
+          <w:rFonts w:ascii="Arial Unicode MS" w:hAnsi="Arial Unicode MS" w:eastAsia="Arial Unicode MS"/>
+        </w:rPr>
+        <w:t>微信不会向小程序提供用户的私人微信号。新增管理员前，必须先让对方登录小程序，再优先用已绑定手机号查找；没有手机号时使用用户 ID 核对，不要仅凭同名昵称授权。</w:t>
+      </w:r>
+    </w:p>
+    <w:p>
+      <w:pPr>
+        <w:pStyle w:val="Heading2"/>
+      </w:pPr>
+      <w:r>
+        <w:rPr>
+          <w:rFonts w:ascii="Arial Unicode MS" w:hAnsi="Arial Unicode MS" w:eastAsia="Arial Unicode MS"/>
+        </w:rPr>
         <w:t>1.1 进入路径</w:t>
       </w:r>
     </w:p>
@@ -1454,7 +1506,7 @@
                 <w:rFonts w:ascii="Arial Unicode MS" w:hAnsi="Arial Unicode MS" w:eastAsia="Arial Unicode MS"/>
                 <w:sz w:val="18"/>
               </w:rPr>
-              <w:t>用户权限赠送、正式小程序码、VIP 套餐</w:t>
+              <w:t>管理员管理（仅最高管理员）、用户权限赠送、正式小程序码、VIP 套餐</w:t>
             </w:r>
           </w:p>
         </w:tc>
@@ -7483,7 +7535,7 @@
         <w:rPr>
           <w:rFonts w:ascii="Arial Unicode MS" w:hAnsi="Arial Unicode MS" w:eastAsia="Arial Unicode MS"/>
         </w:rPr>
-        <w:t>13. 给特定用户免费开通权限</w:t>
+        <w:t>13. 管理管理员（仅最高管理员）</w:t>
       </w:r>
     </w:p>
     <w:p>
@@ -7494,7 +7546,7 @@
         <w:rPr>
           <w:rFonts w:ascii="Arial Unicode MS" w:hAnsi="Arial Unicode MS" w:eastAsia="Arial Unicode MS"/>
         </w:rPr>
-        <w:t>13.1 查找用户</w:t>
+        <w:t>13.1 查看全部用户和管理员</w:t>
       </w:r>
     </w:p>
     <w:p>
@@ -7513,7 +7565,7 @@
         <w:rPr>
           <w:rFonts w:ascii="Arial Unicode MS" w:hAnsi="Arial Unicode MS" w:eastAsia="Arial Unicode MS"/>
         </w:rPr>
-        <w:t>用户必须至少登录过一次小程序。</w:t>
+        <w:t>进入“管理员工作台 -&gt; 管理员管理”。</w:t>
       </w:r>
     </w:p>
     <w:p>
@@ -7532,7 +7584,7 @@
         <w:rPr>
           <w:rFonts w:ascii="Arial Unicode MS" w:hAnsi="Arial Unicode MS" w:eastAsia="Arial Unicode MS"/>
         </w:rPr>
-        <w:t>进入“管理员工作台 -&gt; 用户权限赠送”。</w:t>
+        <w:t>点击“全部用户”，可分页查看已经登录过小程序的所有用户；点击“加载更多”查看后续用户，列表同时显示各账号现有的最近登录时间。</w:t>
       </w:r>
     </w:p>
     <w:p>
@@ -7551,7 +7603,7 @@
         <w:rPr>
           <w:rFonts w:ascii="Arial Unicode MS" w:hAnsi="Arial Unicode MS" w:eastAsia="Arial Unicode MS"/>
         </w:rPr>
-        <w:t>输入用户完整手机号或昵称。</w:t>
+        <w:t>点击“管理员”，只查看当前最高管理员和普通管理员。</w:t>
       </w:r>
     </w:p>
     <w:p>
@@ -7570,7 +7622,7 @@
         <w:rPr>
           <w:rFonts w:ascii="Arial Unicode MS" w:hAnsi="Arial Unicode MS" w:eastAsia="Arial Unicode MS"/>
         </w:rPr>
-        <w:t>点击“搜索”。</w:t>
+        <w:t>使用顶部搜索框，可按已绑定手机号、昵称或用户 ID 查找用户；清除搜索后恢复用户列表。</w:t>
       </w:r>
     </w:p>
     <w:p>
@@ -7589,7 +7641,26 @@
         <w:rPr>
           <w:rFonts w:ascii="Arial Unicode MS" w:hAnsi="Arial Unicode MS" w:eastAsia="Arial Unicode MS"/>
         </w:rPr>
-        <w:t>核对昵称、手机号、VIP 到期日和督学到期日。</w:t>
+        <w:t>列表中的“最高管理员”“管理员”“普通用户”标识表示该账号的当前权限。</w:t>
+      </w:r>
+    </w:p>
+    <w:p>
+      <w:r>
+        <w:rPr>
+          <w:rFonts w:ascii="Arial Unicode MS" w:hAnsi="Arial Unicode MS" w:eastAsia="Arial Unicode MS"/>
+        </w:rPr>
+        <w:t>只有最高管理员能够打开此页面并读取完整用户列表。普通管理员即使尝试直接调用接口，也不能查看全部用户、搜索用户或读取管理员列表。</w:t>
+      </w:r>
+    </w:p>
+    <w:p>
+      <w:pPr>
+        <w:pStyle w:val="Heading2"/>
+      </w:pPr>
+      <w:r>
+        <w:rPr>
+          <w:rFonts w:ascii="Arial Unicode MS" w:hAnsi="Arial Unicode MS" w:eastAsia="Arial Unicode MS"/>
+        </w:rPr>
+        <w:t>13.2 新增普通管理员</w:t>
       </w:r>
     </w:p>
     <w:p>
@@ -7602,12 +7673,418 @@
           <w:b/>
           <w:color w:val="2563EB"/>
         </w:rPr>
+        <w:t xml:space="preserve">1. </w:t>
+      </w:r>
+      <w:r>
+        <w:rPr>
+          <w:rFonts w:ascii="Arial Unicode MS" w:hAnsi="Arial Unicode MS" w:eastAsia="Arial Unicode MS"/>
+        </w:rPr>
+        <w:t>让对方先使用自己的微信登录一次小程序。</w:t>
+      </w:r>
+    </w:p>
+    <w:p>
+      <w:pPr>
+        <w:ind w:left="397" w:hanging="227"/>
+      </w:pPr>
+      <w:r>
+        <w:rPr>
+          <w:rFonts w:ascii="Arial Unicode MS" w:hAnsi="Arial Unicode MS" w:eastAsia="Arial Unicode MS"/>
+          <w:b/>
+          <w:color w:val="2563EB"/>
+        </w:rPr>
+        <w:t xml:space="preserve">2. </w:t>
+      </w:r>
+      <w:r>
+        <w:rPr>
+          <w:rFonts w:ascii="Arial Unicode MS" w:hAnsi="Arial Unicode MS" w:eastAsia="Arial Unicode MS"/>
+        </w:rPr>
+        <w:t>建议让对方在登录页绑定手机号，便于唯一核对身份。</w:t>
+      </w:r>
+    </w:p>
+    <w:p>
+      <w:pPr>
+        <w:ind w:left="397" w:hanging="227"/>
+      </w:pPr>
+      <w:r>
+        <w:rPr>
+          <w:rFonts w:ascii="Arial Unicode MS" w:hAnsi="Arial Unicode MS" w:eastAsia="Arial Unicode MS"/>
+          <w:b/>
+          <w:color w:val="2563EB"/>
+        </w:rPr>
+        <w:t xml:space="preserve">3. </w:t>
+      </w:r>
+      <w:r>
+        <w:rPr>
+          <w:rFonts w:ascii="Arial Unicode MS" w:hAnsi="Arial Unicode MS" w:eastAsia="Arial Unicode MS"/>
+        </w:rPr>
+        <w:t>最高管理员进入“管理员工作台 -&gt; 管理员管理”。</w:t>
+      </w:r>
+    </w:p>
+    <w:p>
+      <w:pPr>
+        <w:ind w:left="397" w:hanging="227"/>
+      </w:pPr>
+      <w:r>
+        <w:rPr>
+          <w:rFonts w:ascii="Arial Unicode MS" w:hAnsi="Arial Unicode MS" w:eastAsia="Arial Unicode MS"/>
+          <w:b/>
+          <w:color w:val="2563EB"/>
+        </w:rPr>
+        <w:t xml:space="preserve">4. </w:t>
+      </w:r>
+      <w:r>
+        <w:rPr>
+          <w:rFonts w:ascii="Arial Unicode MS" w:hAnsi="Arial Unicode MS" w:eastAsia="Arial Unicode MS"/>
+        </w:rPr>
+        <w:t>输入手机号、昵称或用户 ID，点击“搜索”。</w:t>
+      </w:r>
+    </w:p>
+    <w:p>
+      <w:pPr>
+        <w:ind w:left="397" w:hanging="227"/>
+      </w:pPr>
+      <w:r>
+        <w:rPr>
+          <w:rFonts w:ascii="Arial Unicode MS" w:hAnsi="Arial Unicode MS" w:eastAsia="Arial Unicode MS"/>
+          <w:b/>
+          <w:color w:val="2563EB"/>
+        </w:rPr>
+        <w:t xml:space="preserve">5. </w:t>
+      </w:r>
+      <w:r>
+        <w:rPr>
+          <w:rFonts w:ascii="Arial Unicode MS" w:hAnsi="Arial Unicode MS" w:eastAsia="Arial Unicode MS"/>
+        </w:rPr>
+        <w:t>核对头像、昵称、手机号或用户 ID，选中正确用户。</w:t>
+      </w:r>
+    </w:p>
+    <w:p>
+      <w:pPr>
+        <w:ind w:left="397" w:hanging="227"/>
+      </w:pPr>
+      <w:r>
+        <w:rPr>
+          <w:rFonts w:ascii="Arial Unicode MS" w:hAnsi="Arial Unicode MS" w:eastAsia="Arial Unicode MS"/>
+          <w:b/>
+          <w:color w:val="2563EB"/>
+        </w:rPr>
         <w:t xml:space="preserve">6. </w:t>
       </w:r>
       <w:r>
         <w:rPr>
           <w:rFonts w:ascii="Arial Unicode MS" w:hAnsi="Arial Unicode MS" w:eastAsia="Arial Unicode MS"/>
         </w:rPr>
+        <w:t>点击“设为管理员”，在确认弹窗中再次核对。</w:t>
+      </w:r>
+    </w:p>
+    <w:p>
+      <w:r>
+        <w:rPr>
+          <w:rFonts w:ascii="Arial Unicode MS" w:hAnsi="Arial Unicode MS" w:eastAsia="Arial Unicode MS"/>
+        </w:rPr>
+        <w:t xml:space="preserve">微信号（例如 </w:t>
+      </w:r>
+      <w:r>
+        <w:rPr>
+          <w:rFonts w:ascii="Consolas" w:hAnsi="Consolas" w:eastAsia="Consolas"/>
+          <w:color w:val="0F172A"/>
+          <w:sz w:val="19"/>
+          <w:shd w:fill="E2E8F0"/>
+        </w:rPr>
+        <w:t>Jack200493</w:t>
+      </w:r>
+      <w:r>
+        <w:rPr>
+          <w:rFonts w:ascii="Arial Unicode MS" w:hAnsi="Arial Unicode MS" w:eastAsia="Arial Unicode MS"/>
+        </w:rPr>
+        <w:t>）属于微信私人账号标识，小程序无法读取或搜索。不得只凭同名昵称授权；同名时必须使用手机号或用户 ID 核对。</w:t>
+      </w:r>
+    </w:p>
+    <w:p>
+      <w:pPr>
+        <w:pStyle w:val="Heading2"/>
+      </w:pPr>
+      <w:r>
+        <w:rPr>
+          <w:rFonts w:ascii="Arial Unicode MS" w:hAnsi="Arial Unicode MS" w:eastAsia="Arial Unicode MS"/>
+        </w:rPr>
+        <w:t>13.3 取消普通管理员</w:t>
+      </w:r>
+    </w:p>
+    <w:p>
+      <w:pPr>
+        <w:ind w:left="397" w:hanging="227"/>
+      </w:pPr>
+      <w:r>
+        <w:rPr>
+          <w:rFonts w:ascii="Arial Unicode MS" w:hAnsi="Arial Unicode MS" w:eastAsia="Arial Unicode MS"/>
+          <w:b/>
+          <w:color w:val="2563EB"/>
+        </w:rPr>
+        <w:t xml:space="preserve">1. </w:t>
+      </w:r>
+      <w:r>
+        <w:rPr>
+          <w:rFonts w:ascii="Arial Unicode MS" w:hAnsi="Arial Unicode MS" w:eastAsia="Arial Unicode MS"/>
+        </w:rPr>
+        <w:t>在“管理员管理”中查找并选中目标管理员。</w:t>
+      </w:r>
+    </w:p>
+    <w:p>
+      <w:pPr>
+        <w:ind w:left="397" w:hanging="227"/>
+      </w:pPr>
+      <w:r>
+        <w:rPr>
+          <w:rFonts w:ascii="Arial Unicode MS" w:hAnsi="Arial Unicode MS" w:eastAsia="Arial Unicode MS"/>
+          <w:b/>
+          <w:color w:val="2563EB"/>
+        </w:rPr>
+        <w:t xml:space="preserve">2. </w:t>
+      </w:r>
+      <w:r>
+        <w:rPr>
+          <w:rFonts w:ascii="Arial Unicode MS" w:hAnsi="Arial Unicode MS" w:eastAsia="Arial Unicode MS"/>
+        </w:rPr>
+        <w:t>点击“取消管理员”。</w:t>
+      </w:r>
+    </w:p>
+    <w:p>
+      <w:pPr>
+        <w:ind w:left="397" w:hanging="227"/>
+      </w:pPr>
+      <w:r>
+        <w:rPr>
+          <w:rFonts w:ascii="Arial Unicode MS" w:hAnsi="Arial Unicode MS" w:eastAsia="Arial Unicode MS"/>
+          <w:b/>
+          <w:color w:val="2563EB"/>
+        </w:rPr>
+        <w:t xml:space="preserve">3. </w:t>
+      </w:r>
+      <w:r>
+        <w:rPr>
+          <w:rFonts w:ascii="Arial Unicode MS" w:hAnsi="Arial Unicode MS" w:eastAsia="Arial Unicode MS"/>
+        </w:rPr>
+        <w:t>确认后，该用户仍是普通小程序用户，但不能再进入管理员工作台。</w:t>
+      </w:r>
+    </w:p>
+    <w:p>
+      <w:r>
+        <w:rPr>
+          <w:rFonts w:ascii="Arial Unicode MS" w:hAnsi="Arial Unicode MS" w:eastAsia="Arial Unicode MS"/>
+        </w:rPr>
+        <w:t>最高管理员不能通过“取消管理员”按钮删除自己的权限，避免系统失去管理账号。</w:t>
+      </w:r>
+    </w:p>
+    <w:p>
+      <w:pPr>
+        <w:pStyle w:val="Heading2"/>
+      </w:pPr>
+      <w:r>
+        <w:rPr>
+          <w:rFonts w:ascii="Arial Unicode MS" w:hAnsi="Arial Unicode MS" w:eastAsia="Arial Unicode MS"/>
+        </w:rPr>
+        <w:t>13.4 移交最高管理员</w:t>
+      </w:r>
+    </w:p>
+    <w:p>
+      <w:pPr>
+        <w:ind w:left="397" w:hanging="227"/>
+      </w:pPr>
+      <w:r>
+        <w:rPr>
+          <w:rFonts w:ascii="Arial Unicode MS" w:hAnsi="Arial Unicode MS" w:eastAsia="Arial Unicode MS"/>
+          <w:b/>
+          <w:color w:val="2563EB"/>
+        </w:rPr>
+        <w:t xml:space="preserve">1. </w:t>
+      </w:r>
+      <w:r>
+        <w:rPr>
+          <w:rFonts w:ascii="Arial Unicode MS" w:hAnsi="Arial Unicode MS" w:eastAsia="Arial Unicode MS"/>
+        </w:rPr>
+        <w:t>查找并选中接收人。</w:t>
+      </w:r>
+    </w:p>
+    <w:p>
+      <w:pPr>
+        <w:ind w:left="397" w:hanging="227"/>
+      </w:pPr>
+      <w:r>
+        <w:rPr>
+          <w:rFonts w:ascii="Arial Unicode MS" w:hAnsi="Arial Unicode MS" w:eastAsia="Arial Unicode MS"/>
+          <w:b/>
+          <w:color w:val="2563EB"/>
+        </w:rPr>
+        <w:t xml:space="preserve">2. </w:t>
+      </w:r>
+      <w:r>
+        <w:rPr>
+          <w:rFonts w:ascii="Arial Unicode MS" w:hAnsi="Arial Unicode MS" w:eastAsia="Arial Unicode MS"/>
+        </w:rPr>
+        <w:t>点击“移交最高管理员”。</w:t>
+      </w:r>
+    </w:p>
+    <w:p>
+      <w:pPr>
+        <w:ind w:left="397" w:hanging="227"/>
+      </w:pPr>
+      <w:r>
+        <w:rPr>
+          <w:rFonts w:ascii="Arial Unicode MS" w:hAnsi="Arial Unicode MS" w:eastAsia="Arial Unicode MS"/>
+          <w:b/>
+          <w:color w:val="2563EB"/>
+        </w:rPr>
+        <w:t xml:space="preserve">3. </w:t>
+      </w:r>
+      <w:r>
+        <w:rPr>
+          <w:rFonts w:ascii="Arial Unicode MS" w:hAnsi="Arial Unicode MS" w:eastAsia="Arial Unicode MS"/>
+        </w:rPr>
+        <w:t>仔细核对确认弹窗后点击“确认移交”。</w:t>
+      </w:r>
+    </w:p>
+    <w:p>
+      <w:r>
+        <w:rPr>
+          <w:rFonts w:ascii="Arial Unicode MS" w:hAnsi="Arial Unicode MS" w:eastAsia="Arial Unicode MS"/>
+        </w:rPr>
+        <w:t>移交完成后，接收人成为唯一最高管理员；原最高管理员自动变为普通管理员。该操作会写入审计记录，只有确定交接时才能执行。</w:t>
+      </w:r>
+    </w:p>
+    <w:p>
+      <w:pPr>
+        <w:pStyle w:val="Heading1"/>
+      </w:pPr>
+      <w:r>
+        <w:rPr>
+          <w:rFonts w:ascii="Arial Unicode MS" w:hAnsi="Arial Unicode MS" w:eastAsia="Arial Unicode MS"/>
+        </w:rPr>
+        <w:t>14. 给特定用户免费开通权限</w:t>
+      </w:r>
+    </w:p>
+    <w:p>
+      <w:pPr>
+        <w:pStyle w:val="Heading2"/>
+      </w:pPr>
+      <w:r>
+        <w:rPr>
+          <w:rFonts w:ascii="Arial Unicode MS" w:hAnsi="Arial Unicode MS" w:eastAsia="Arial Unicode MS"/>
+        </w:rPr>
+        <w:t>14.1 查找用户</w:t>
+      </w:r>
+    </w:p>
+    <w:p>
+      <w:pPr>
+        <w:ind w:left="397" w:hanging="227"/>
+      </w:pPr>
+      <w:r>
+        <w:rPr>
+          <w:rFonts w:ascii="Arial Unicode MS" w:hAnsi="Arial Unicode MS" w:eastAsia="Arial Unicode MS"/>
+          <w:b/>
+          <w:color w:val="2563EB"/>
+        </w:rPr>
+        <w:t xml:space="preserve">1. </w:t>
+      </w:r>
+      <w:r>
+        <w:rPr>
+          <w:rFonts w:ascii="Arial Unicode MS" w:hAnsi="Arial Unicode MS" w:eastAsia="Arial Unicode MS"/>
+        </w:rPr>
+        <w:t>用户必须至少登录过一次小程序。</w:t>
+      </w:r>
+    </w:p>
+    <w:p>
+      <w:pPr>
+        <w:ind w:left="397" w:hanging="227"/>
+      </w:pPr>
+      <w:r>
+        <w:rPr>
+          <w:rFonts w:ascii="Arial Unicode MS" w:hAnsi="Arial Unicode MS" w:eastAsia="Arial Unicode MS"/>
+          <w:b/>
+          <w:color w:val="2563EB"/>
+        </w:rPr>
+        <w:t xml:space="preserve">2. </w:t>
+      </w:r>
+      <w:r>
+        <w:rPr>
+          <w:rFonts w:ascii="Arial Unicode MS" w:hAnsi="Arial Unicode MS" w:eastAsia="Arial Unicode MS"/>
+        </w:rPr>
+        <w:t>进入“管理员工作台 -&gt; 用户权限赠送”。</w:t>
+      </w:r>
+    </w:p>
+    <w:p>
+      <w:pPr>
+        <w:ind w:left="397" w:hanging="227"/>
+      </w:pPr>
+      <w:r>
+        <w:rPr>
+          <w:rFonts w:ascii="Arial Unicode MS" w:hAnsi="Arial Unicode MS" w:eastAsia="Arial Unicode MS"/>
+          <w:b/>
+          <w:color w:val="2563EB"/>
+        </w:rPr>
+        <w:t xml:space="preserve">3. </w:t>
+      </w:r>
+      <w:r>
+        <w:rPr>
+          <w:rFonts w:ascii="Arial Unicode MS" w:hAnsi="Arial Unicode MS" w:eastAsia="Arial Unicode MS"/>
+        </w:rPr>
+        <w:t>输入用户完整手机号或昵称。</w:t>
+      </w:r>
+    </w:p>
+    <w:p>
+      <w:pPr>
+        <w:ind w:left="397" w:hanging="227"/>
+      </w:pPr>
+      <w:r>
+        <w:rPr>
+          <w:rFonts w:ascii="Arial Unicode MS" w:hAnsi="Arial Unicode MS" w:eastAsia="Arial Unicode MS"/>
+          <w:b/>
+          <w:color w:val="2563EB"/>
+        </w:rPr>
+        <w:t xml:space="preserve">4. </w:t>
+      </w:r>
+      <w:r>
+        <w:rPr>
+          <w:rFonts w:ascii="Arial Unicode MS" w:hAnsi="Arial Unicode MS" w:eastAsia="Arial Unicode MS"/>
+        </w:rPr>
+        <w:t>点击“搜索”。</w:t>
+      </w:r>
+    </w:p>
+    <w:p>
+      <w:pPr>
+        <w:ind w:left="397" w:hanging="227"/>
+      </w:pPr>
+      <w:r>
+        <w:rPr>
+          <w:rFonts w:ascii="Arial Unicode MS" w:hAnsi="Arial Unicode MS" w:eastAsia="Arial Unicode MS"/>
+          <w:b/>
+          <w:color w:val="2563EB"/>
+        </w:rPr>
+        <w:t xml:space="preserve">5. </w:t>
+      </w:r>
+      <w:r>
+        <w:rPr>
+          <w:rFonts w:ascii="Arial Unicode MS" w:hAnsi="Arial Unicode MS" w:eastAsia="Arial Unicode MS"/>
+        </w:rPr>
+        <w:t>核对昵称、手机号、VIP 到期日和督学到期日。</w:t>
+      </w:r>
+    </w:p>
+    <w:p>
+      <w:pPr>
+        <w:ind w:left="397" w:hanging="227"/>
+      </w:pPr>
+      <w:r>
+        <w:rPr>
+          <w:rFonts w:ascii="Arial Unicode MS" w:hAnsi="Arial Unicode MS" w:eastAsia="Arial Unicode MS"/>
+          <w:b/>
+          <w:color w:val="2563EB"/>
+        </w:rPr>
+        <w:t xml:space="preserve">6. </w:t>
+      </w:r>
+      <w:r>
+        <w:rPr>
+          <w:rFonts w:ascii="Arial Unicode MS" w:hAnsi="Arial Unicode MS" w:eastAsia="Arial Unicode MS"/>
+        </w:rPr>
         <w:t>点击目标用户右侧“选择”。</w:t>
       </w:r>
     </w:p>
@@ -7627,7 +8104,7 @@
         <w:rPr>
           <w:rFonts w:ascii="Arial Unicode MS" w:hAnsi="Arial Unicode MS" w:eastAsia="Arial Unicode MS"/>
         </w:rPr>
-        <w:t>13.2 选择赠送套餐</w:t>
+        <w:t>14.2 选择赠送套餐</w:t>
       </w:r>
     </w:p>
     <w:tbl>
@@ -7939,7 +8416,7 @@
         <w:rPr>
           <w:rFonts w:ascii="Arial Unicode MS" w:hAnsi="Arial Unicode MS" w:eastAsia="Arial Unicode MS"/>
         </w:rPr>
-        <w:t>13.3 确认开通</w:t>
+        <w:t>14.3 确认开通</w:t>
       </w:r>
     </w:p>
     <w:p>
@@ -8061,7 +8538,7 @@
         <w:rPr>
           <w:rFonts w:ascii="Arial Unicode MS" w:hAnsi="Arial Unicode MS" w:eastAsia="Arial Unicode MS"/>
         </w:rPr>
-        <w:t>14. VIP 套餐管理</w:t>
+        <w:t>15. VIP 套餐管理</w:t>
       </w:r>
     </w:p>
     <w:p>
@@ -8607,7 +9084,7 @@
         <w:rPr>
           <w:rFonts w:ascii="Arial Unicode MS" w:hAnsi="Arial Unicode MS" w:eastAsia="Arial Unicode MS"/>
         </w:rPr>
-        <w:t>15. 日常发布检查清单</w:t>
+        <w:t>16. 日常发布检查清单</w:t>
       </w:r>
     </w:p>
     <w:p>
@@ -8618,7 +9095,7 @@
         <w:rPr>
           <w:rFonts w:ascii="Arial Unicode MS" w:hAnsi="Arial Unicode MS" w:eastAsia="Arial Unicode MS"/>
         </w:rPr>
-        <w:t>15.1 内容上传后</w:t>
+        <w:t>16.1 内容上传后</w:t>
       </w:r>
     </w:p>
     <w:p>
@@ -8719,7 +9196,7 @@
         <w:rPr>
           <w:rFonts w:ascii="Arial Unicode MS" w:hAnsi="Arial Unicode MS" w:eastAsia="Arial Unicode MS"/>
         </w:rPr>
-        <w:t>15.2 题库更新后</w:t>
+        <w:t>16.2 题库更新后</w:t>
       </w:r>
     </w:p>
     <w:p>
@@ -8820,7 +9297,7 @@
         <w:rPr>
           <w:rFonts w:ascii="Arial Unicode MS" w:hAnsi="Arial Unicode MS" w:eastAsia="Arial Unicode MS"/>
         </w:rPr>
-        <w:t>15.3 运营配置后</w:t>
+        <w:t>16.3 运营配置后</w:t>
       </w:r>
     </w:p>
     <w:p>
@@ -8936,7 +9413,7 @@
         <w:rPr>
           <w:rFonts w:ascii="Arial Unicode MS" w:hAnsi="Arial Unicode MS" w:eastAsia="Arial Unicode MS"/>
         </w:rPr>
-        <w:t>15.4 权限赠送后</w:t>
+        <w:t>16.4 权限赠送后</w:t>
       </w:r>
     </w:p>
     <w:p>
@@ -9019,7 +9496,7 @@
         <w:rPr>
           <w:rFonts w:ascii="Arial Unicode MS" w:hAnsi="Arial Unicode MS" w:eastAsia="Arial Unicode MS"/>
         </w:rPr>
-        <w:t>16. 常见问题</w:t>
+        <w:t>17. 常见问题</w:t>
       </w:r>
     </w:p>
     <w:p>
@@ -9030,7 +9507,7 @@
         <w:rPr>
           <w:rFonts w:ascii="Arial Unicode MS" w:hAnsi="Arial Unicode MS" w:eastAsia="Arial Unicode MS"/>
         </w:rPr>
-        <w:t>16.1 上传按钮没有反应</w:t>
+        <w:t>17.1 上传按钮没有反应</w:t>
       </w:r>
     </w:p>
     <w:p>
@@ -9049,7 +9526,7 @@
         <w:rPr>
           <w:rFonts w:ascii="Arial Unicode MS" w:hAnsi="Arial Unicode MS" w:eastAsia="Arial Unicode MS"/>
         </w:rPr>
-        <w:t>16.2 CSV 校验不通过</w:t>
+        <w:t>17.2 CSV 校验不通过</w:t>
       </w:r>
     </w:p>
     <w:p>
@@ -9068,7 +9545,7 @@
         <w:rPr>
           <w:rFonts w:ascii="Arial Unicode MS" w:hAnsi="Arial Unicode MS" w:eastAsia="Arial Unicode MS"/>
         </w:rPr>
-        <w:t>16.3 上传成功但用户端看不到</w:t>
+        <w:t>17.3 上传成功但用户端看不到</w:t>
       </w:r>
     </w:p>
     <w:p>
@@ -9087,7 +9564,7 @@
         <w:rPr>
           <w:rFonts w:ascii="Arial Unicode MS" w:hAnsi="Arial Unicode MS" w:eastAsia="Arial Unicode MS"/>
         </w:rPr>
-        <w:t>16.4 资料图片没有封面</w:t>
+        <w:t>17.4 资料图片没有封面</w:t>
       </w:r>
     </w:p>
     <w:p>
@@ -9106,7 +9583,7 @@
         <w:rPr>
           <w:rFonts w:ascii="Arial Unicode MS" w:hAnsi="Arial Unicode MS" w:eastAsia="Arial Unicode MS"/>
         </w:rPr>
-        <w:t>16.5 广告不展示</w:t>
+        <w:t>17.5 广告不展示</w:t>
       </w:r>
     </w:p>
     <w:p>
@@ -9125,7 +9602,7 @@
         <w:rPr>
           <w:rFonts w:ascii="Arial Unicode MS" w:hAnsi="Arial Unicode MS" w:eastAsia="Arial Unicode MS"/>
         </w:rPr>
-        <w:t>16.6 搜不到用户</w:t>
+        <w:t>17.6 搜不到用户</w:t>
       </w:r>
     </w:p>
     <w:p>
@@ -9144,7 +9621,7 @@
         <w:rPr>
           <w:rFonts w:ascii="Arial Unicode MS" w:hAnsi="Arial Unicode MS" w:eastAsia="Arial Unicode MS"/>
         </w:rPr>
-        <w:t>16.7 赠送后订单中心没有记录</w:t>
+        <w:t>17.7 赠送后订单中心没有记录</w:t>
       </w:r>
     </w:p>
     <w:p>
@@ -9163,7 +9640,7 @@
         <w:rPr>
           <w:rFonts w:ascii="Arial Unicode MS" w:hAnsi="Arial Unicode MS" w:eastAsia="Arial Unicode MS"/>
         </w:rPr>
-        <w:t>16.8 正式小程序码生成失败</w:t>
+        <w:t>17.8 正式小程序码生成失败</w:t>
       </w:r>
     </w:p>
     <w:p>
@@ -9197,7 +9674,7 @@
         <w:rPr>
           <w:rFonts w:ascii="Arial Unicode MS" w:hAnsi="Arial Unicode MS" w:eastAsia="Arial Unicode MS"/>
         </w:rPr>
-        <w:t>17. 客户交付验收</w:t>
+        <w:t>18. 客户交付验收</w:t>
       </w:r>
     </w:p>
     <w:p>

</xml_diff>

<commit_message>
feat: require unique phone identity for login
</commit_message>
<xml_diff>
--- a/output/doc/仕舟小程序管理员运营操作手册.docx
+++ b/output/doc/仕舟小程序管理员运营操作手册.docx
@@ -1181,7 +1181,15 @@
         <w:rPr>
           <w:rFonts w:ascii="Arial Unicode MS" w:hAnsi="Arial Unicode MS" w:eastAsia="Arial Unicode MS"/>
         </w:rPr>
-        <w:t>微信不会向小程序提供用户的私人微信号。新增管理员前，必须先让对方登录小程序，再优先用已绑定手机号查找；没有手机号时使用用户 ID 核对，不要仅凭同名昵称授权。</w:t>
+        <w:t>微信不会向小程序提供用户的私人微信号。所有账号登录时都必须通过微信官方能力授权并绑定手机号，手机号是唯一业务标识。新增管理员前，必须先让对方完成登录，再使用手机号查找和核对，不要仅凭同名昵称授权。</w:t>
+      </w:r>
+    </w:p>
+    <w:p>
+      <w:r>
+        <w:rPr>
+          <w:rFonts w:ascii="Arial Unicode MS" w:hAnsi="Arial Unicode MS" w:eastAsia="Arial Unicode MS"/>
+        </w:rPr>
+        <w:t>历史无手机号账号会在更新后的版本中退出旧登录状态，并在下次登录时要求补绑手机号。补绑会保留原用户 ID、管理员角色、舟币、答题记录、学习记录和订单，不会创建第二份账号。已绑定手机号不能在登录页自行更换，确需换号时联系软件服务商核验处理。</w:t>
       </w:r>
     </w:p>
     <w:p>
@@ -1230,7 +1238,7 @@
         <w:rPr>
           <w:rFonts w:ascii="Arial Unicode MS" w:hAnsi="Arial Unicode MS" w:eastAsia="Arial Unicode MS"/>
         </w:rPr>
-        <w:t>完成小程序登录。</w:t>
+        <w:t>勾选用户协议和隐私政策，点击“微信登录并绑定手机号”，完成手机号授权登录。</w:t>
       </w:r>
     </w:p>
     <w:p>
@@ -7679,7 +7687,7 @@
         <w:rPr>
           <w:rFonts w:ascii="Arial Unicode MS" w:hAnsi="Arial Unicode MS" w:eastAsia="Arial Unicode MS"/>
         </w:rPr>
-        <w:t>让对方先使用自己的微信登录一次小程序。</w:t>
+        <w:t>让对方先使用自己的微信打开小程序。</w:t>
       </w:r>
     </w:p>
     <w:p>
@@ -7698,7 +7706,7 @@
         <w:rPr>
           <w:rFonts w:ascii="Arial Unicode MS" w:hAnsi="Arial Unicode MS" w:eastAsia="Arial Unicode MS"/>
         </w:rPr>
-        <w:t>建议让对方在登录页绑定手机号，便于唯一核对身份。</w:t>
+        <w:t>让对方勾选协议并点击“微信登录并绑定手机号”，完成账号登录。</w:t>
       </w:r>
     </w:p>
     <w:p>
@@ -8093,7 +8101,7 @@
         <w:rPr>
           <w:rFonts w:ascii="Arial Unicode MS" w:hAnsi="Arial Unicode MS" w:eastAsia="Arial Unicode MS"/>
         </w:rPr>
-        <w:t>手机号搜索要求用户登录时已经授权绑定手机号。无法按手机号找到时，可以使用昵称搜索。</w:t>
+        <w:t>所有已登录账号都应具有已验证手机号。优先使用完整手机号搜索；无法找到时，先让用户确认已在最新版本中完成手机号授权登录，再核对昵称或用户 ID。</w:t>
       </w:r>
     </w:p>
     <w:p>
@@ -9610,7 +9618,7 @@
         <w:rPr>
           <w:rFonts w:ascii="Arial Unicode MS" w:hAnsi="Arial Unicode MS" w:eastAsia="Arial Unicode MS"/>
         </w:rPr>
-        <w:t>用户必须登录过小程序。手机号搜索还要求用户已授权绑定手机号，可以改用昵称搜索。</w:t>
+        <w:t>用户必须在最新版本中完成“微信登录并绑定手机号”。先核对输入的完整手机号；仍搜不到时，让用户退出后重新授权登录，再用昵称或用户 ID 辅助核对。</w:t>
       </w:r>
     </w:p>
     <w:p>

</xml_diff>